<commit_message>
work on CSVWrite and add DAQ pass elapsed time measurement
</commit_message>
<xml_diff>
--- a/Beckhoff PLC Commissioning document.docx
+++ b/Beckhoff PLC Commissioning document.docx
@@ -1443,7 +1443,16 @@
         <w:t>runs</w:t>
       </w:r>
       <w:r>
-        <w:t xml:space="preserve">, run time, temperature, </w:t>
+        <w:t xml:space="preserve">, run time, </w:t>
+      </w:r>
+      <w:r>
+        <w:t>(</w:t>
+      </w:r>
+      <w:r>
+        <w:t>temperature</w:t>
+      </w:r>
+      <w:r>
+        <w:t>?)</w:t>
       </w:r>
     </w:p>
     <w:p>
@@ -1464,9 +1473,6 @@
         <w:widowControl w:val="0"/>
         <w:spacing w:line="240" w:lineRule="auto"/>
       </w:pPr>
-      <w:r>
-        <w:t>asdf</w:t>
-      </w:r>
     </w:p>
     <w:p>
       <w:pPr>

</xml_diff>

<commit_message>
fixed issue with homing routine - now can home if x axes are coupled and exits with axes coupled
</commit_message>
<xml_diff>
--- a/Beckhoff PLC Commissioning document.docx
+++ b/Beckhoff PLC Commissioning document.docx
@@ -1463,7 +1463,13 @@
         <w:spacing w:line="240" w:lineRule="auto"/>
       </w:pPr>
       <w:r>
+        <w:t>(</w:t>
+      </w:r>
+      <w:r>
         <w:t>For each sensor – attached to x or xy or xyz or none</w:t>
+      </w:r>
+      <w:r>
+        <w:t xml:space="preserve">?) </w:t>
       </w:r>
     </w:p>
     <w:p>

</xml_diff>

<commit_message>
data dump prototype - csvwrite
</commit_message>
<xml_diff>
--- a/Beckhoff PLC Commissioning document.docx
+++ b/Beckhoff PLC Commissioning document.docx
@@ -46,8 +46,16 @@
         <w:rPr>
           <w:b/>
         </w:rPr>
-        <w:t>Google search site:infosys.beckhoff.com</w:t>
-      </w:r>
+        <w:t xml:space="preserve">Google search </w:t>
+      </w:r>
+      <w:proofErr w:type="gramStart"/>
+      <w:r>
+        <w:rPr>
+          <w:b/>
+        </w:rPr>
+        <w:t>site:infosys.beckhoff.com</w:t>
+      </w:r>
+      <w:proofErr w:type="gramEnd"/>
     </w:p>
     <w:p>
       <w:pPr>
@@ -78,86 +86,131 @@
         <w:widowControl w:val="0"/>
         <w:spacing w:line="240" w:lineRule="auto"/>
       </w:pPr>
-      <w:r>
-        <w:t>CoE CANOpen over Ethernet</w:t>
-      </w:r>
-    </w:p>
-    <w:p>
-      <w:pPr>
-        <w:keepNext/>
-        <w:keepLines/>
-        <w:widowControl w:val="0"/>
-        <w:spacing w:line="240" w:lineRule="auto"/>
-      </w:pPr>
-    </w:p>
-    <w:p>
-      <w:pPr>
-        <w:keepNext/>
-        <w:keepLines/>
-        <w:widowControl w:val="0"/>
-        <w:spacing w:line="240" w:lineRule="auto"/>
-      </w:pPr>
-      <w:r>
-        <w:t>TwinCat 3 version used: 4026.18</w:t>
-      </w:r>
-    </w:p>
-    <w:p>
-      <w:pPr>
-        <w:keepNext/>
-        <w:keepLines/>
-        <w:widowControl w:val="0"/>
-        <w:spacing w:line="240" w:lineRule="auto"/>
-      </w:pPr>
-    </w:p>
-    <w:p>
-      <w:pPr>
-        <w:keepNext/>
-        <w:keepLines/>
-        <w:widowControl w:val="0"/>
-        <w:spacing w:line="240" w:lineRule="auto"/>
-        <w:rPr>
-          <w:b/>
-        </w:rPr>
-      </w:pPr>
-      <w:r>
-        <w:rPr>
-          <w:b/>
-        </w:rPr>
-        <w:t>Relevant TwinCat packages:</w:t>
-      </w:r>
-    </w:p>
-    <w:p>
-      <w:pPr>
-        <w:keepNext/>
-        <w:keepLines/>
-        <w:widowControl w:val="0"/>
-        <w:spacing w:line="240" w:lineRule="auto"/>
-      </w:pPr>
-      <w:r>
-        <w:t>TC1000 adc communication spec</w:t>
-      </w:r>
-    </w:p>
-    <w:p>
-      <w:pPr>
-        <w:keepNext/>
-        <w:keepLines/>
-        <w:widowControl w:val="0"/>
-        <w:spacing w:line="240" w:lineRule="auto"/>
-      </w:pPr>
-      <w:r>
-        <w:t>TE5950 drive manager</w:t>
-      </w:r>
-    </w:p>
-    <w:p>
-      <w:pPr>
-        <w:keepNext/>
-        <w:keepLines/>
-        <w:widowControl w:val="0"/>
-        <w:spacing w:line="240" w:lineRule="auto"/>
-      </w:pPr>
+      <w:proofErr w:type="spellStart"/>
+      <w:r>
+        <w:t>CoE</w:t>
+      </w:r>
+      <w:proofErr w:type="spellEnd"/>
       <w:r>
         <w:t xml:space="preserve"> </w:t>
       </w:r>
+      <w:proofErr w:type="spellStart"/>
+      <w:r>
+        <w:t>CANOpen</w:t>
+      </w:r>
+      <w:proofErr w:type="spellEnd"/>
+      <w:r>
+        <w:t xml:space="preserve"> over Ethernet</w:t>
+      </w:r>
+    </w:p>
+    <w:p>
+      <w:pPr>
+        <w:keepNext/>
+        <w:keepLines/>
+        <w:widowControl w:val="0"/>
+        <w:spacing w:line="240" w:lineRule="auto"/>
+      </w:pPr>
+    </w:p>
+    <w:p>
+      <w:pPr>
+        <w:keepNext/>
+        <w:keepLines/>
+        <w:widowControl w:val="0"/>
+        <w:spacing w:line="240" w:lineRule="auto"/>
+      </w:pPr>
+      <w:proofErr w:type="spellStart"/>
+      <w:r>
+        <w:t>TwinCat</w:t>
+      </w:r>
+      <w:proofErr w:type="spellEnd"/>
+      <w:r>
+        <w:t xml:space="preserve"> 3 version used: 4026.18</w:t>
+      </w:r>
+    </w:p>
+    <w:p>
+      <w:pPr>
+        <w:keepNext/>
+        <w:keepLines/>
+        <w:widowControl w:val="0"/>
+        <w:spacing w:line="240" w:lineRule="auto"/>
+      </w:pPr>
+    </w:p>
+    <w:p>
+      <w:pPr>
+        <w:keepNext/>
+        <w:keepLines/>
+        <w:widowControl w:val="0"/>
+        <w:spacing w:line="240" w:lineRule="auto"/>
+        <w:rPr>
+          <w:b/>
+        </w:rPr>
+      </w:pPr>
+      <w:r>
+        <w:rPr>
+          <w:b/>
+        </w:rPr>
+        <w:t xml:space="preserve">Relevant </w:t>
+      </w:r>
+      <w:proofErr w:type="spellStart"/>
+      <w:r>
+        <w:rPr>
+          <w:b/>
+        </w:rPr>
+        <w:t>TwinCat</w:t>
+      </w:r>
+      <w:proofErr w:type="spellEnd"/>
+      <w:r>
+        <w:rPr>
+          <w:b/>
+        </w:rPr>
+        <w:t xml:space="preserve"> packages:</w:t>
+      </w:r>
+    </w:p>
+    <w:p>
+      <w:pPr>
+        <w:keepNext/>
+        <w:keepLines/>
+        <w:widowControl w:val="0"/>
+        <w:spacing w:line="240" w:lineRule="auto"/>
+      </w:pPr>
+      <w:r>
+        <w:t xml:space="preserve">TC1000 </w:t>
+      </w:r>
+      <w:proofErr w:type="spellStart"/>
+      <w:r>
+        <w:t>adc</w:t>
+      </w:r>
+      <w:proofErr w:type="spellEnd"/>
+      <w:r>
+        <w:t xml:space="preserve"> communication spec</w:t>
+      </w:r>
+    </w:p>
+    <w:p>
+      <w:pPr>
+        <w:keepNext/>
+        <w:keepLines/>
+        <w:widowControl w:val="0"/>
+        <w:spacing w:line="240" w:lineRule="auto"/>
+      </w:pPr>
+      <w:r>
+        <w:t xml:space="preserve">TE5950 </w:t>
+      </w:r>
+      <w:proofErr w:type="gramStart"/>
+      <w:r>
+        <w:t>drive manager</w:t>
+      </w:r>
+      <w:proofErr w:type="gramEnd"/>
+    </w:p>
+    <w:p>
+      <w:pPr>
+        <w:keepNext/>
+        <w:keepLines/>
+        <w:widowControl w:val="0"/>
+        <w:spacing w:line="240" w:lineRule="auto"/>
+      </w:pPr>
+      <w:r>
+        <w:t xml:space="preserve"> </w:t>
+      </w:r>
     </w:p>
     <w:p>
       <w:pPr>
@@ -247,7 +300,15 @@
         <w:spacing w:line="240" w:lineRule="auto"/>
       </w:pPr>
       <w:r>
-        <w:t>EL30xx -&gt; analog input 12 bit resolution</w:t>
+        <w:t xml:space="preserve">EL30xx -&gt; analog input </w:t>
+      </w:r>
+      <w:proofErr w:type="gramStart"/>
+      <w:r>
+        <w:t>12 bit</w:t>
+      </w:r>
+      <w:proofErr w:type="gramEnd"/>
+      <w:r>
+        <w:t xml:space="preserve"> resolution</w:t>
       </w:r>
     </w:p>
     <w:p>
@@ -264,7 +325,15 @@
         <w:t>74-0090</w:t>
       </w:r>
       <w:r>
-        <w:t xml:space="preserve"> -&gt; analog input 16 bit resolution</w:t>
+        <w:t xml:space="preserve"> -&gt; analog input </w:t>
+      </w:r>
+      <w:proofErr w:type="gramStart"/>
+      <w:r>
+        <w:t>16 bit</w:t>
+      </w:r>
+      <w:proofErr w:type="gramEnd"/>
+      <w:r>
+        <w:t xml:space="preserve"> resolution</w:t>
       </w:r>
       <w:r>
         <w:t xml:space="preserve"> v/I -&gt; minimum cycle time 500us</w:t>
@@ -278,7 +347,15 @@
         <w:spacing w:line="240" w:lineRule="auto"/>
       </w:pPr>
       <w:r>
-        <w:t>EL36xx -&gt; analog input 24 bit resolution</w:t>
+        <w:t xml:space="preserve">EL36xx -&gt; analog input </w:t>
+      </w:r>
+      <w:proofErr w:type="gramStart"/>
+      <w:r>
+        <w:t>24 bit</w:t>
+      </w:r>
+      <w:proofErr w:type="gramEnd"/>
+      <w:r>
+        <w:t xml:space="preserve"> resolution</w:t>
       </w:r>
     </w:p>
     <w:p>
@@ -322,7 +399,15 @@
         <w:spacing w:line="240" w:lineRule="auto"/>
       </w:pPr>
       <w:r>
-        <w:t>Must be in config mode to scan hardware in i/o manager</w:t>
+        <w:t xml:space="preserve">Must be in config mode to scan hardware in </w:t>
+      </w:r>
+      <w:proofErr w:type="spellStart"/>
+      <w:r>
+        <w:t>i</w:t>
+      </w:r>
+      <w:proofErr w:type="spellEnd"/>
+      <w:r>
+        <w:t>/o manager</w:t>
       </w:r>
     </w:p>
     <w:p>
@@ -443,7 +528,15 @@
         <w:spacing w:line="240" w:lineRule="auto"/>
       </w:pPr>
       <w:r>
-        <w:t>8 pin m12 cable – pin 1/ red (tensility cable) must be wired to 0v, el7062 input 9</w:t>
+        <w:t>8 pin m12 cable – pin 1/ red (</w:t>
+      </w:r>
+      <w:proofErr w:type="spellStart"/>
+      <w:r>
+        <w:t>tensility</w:t>
+      </w:r>
+      <w:proofErr w:type="spellEnd"/>
+      <w:r>
+        <w:t xml:space="preserve"> cable) must be wired to 0v, el7062 input 9</w:t>
       </w:r>
     </w:p>
     <w:p>
@@ -505,8 +598,31 @@
         <w:widowControl w:val="0"/>
         <w:spacing w:line="240" w:lineRule="auto"/>
       </w:pPr>
-      <w:r>
-        <w:t>Cant have 2 of same mc function block (eg mc_moveabsolute) in same program</w:t>
+      <w:proofErr w:type="spellStart"/>
+      <w:proofErr w:type="gramStart"/>
+      <w:r>
+        <w:t>Cant</w:t>
+      </w:r>
+      <w:proofErr w:type="spellEnd"/>
+      <w:proofErr w:type="gramEnd"/>
+      <w:r>
+        <w:t xml:space="preserve"> have 2 of same mc function block (</w:t>
+      </w:r>
+      <w:proofErr w:type="spellStart"/>
+      <w:r>
+        <w:t>eg</w:t>
+      </w:r>
+      <w:proofErr w:type="spellEnd"/>
+      <w:r>
+        <w:t xml:space="preserve"> </w:t>
+      </w:r>
+      <w:proofErr w:type="spellStart"/>
+      <w:r>
+        <w:t>mc_moveabsolute</w:t>
+      </w:r>
+      <w:proofErr w:type="spellEnd"/>
+      <w:r>
+        <w:t>) in same program</w:t>
       </w:r>
     </w:p>
     <w:p>
@@ -554,8 +670,13 @@
         <w:widowControl w:val="0"/>
         <w:spacing w:line="240" w:lineRule="auto"/>
       </w:pPr>
-      <w:r>
-        <w:t>Program(PRG): Called directly. Can assign task. Only one instance</w:t>
+      <w:proofErr w:type="gramStart"/>
+      <w:r>
+        <w:t>Program(</w:t>
+      </w:r>
+      <w:proofErr w:type="gramEnd"/>
+      <w:r>
+        <w:t>PRG): Called directly. Can assign task. Only one instance</w:t>
       </w:r>
     </w:p>
     <w:p>
@@ -729,13 +850,27 @@
         <w:rPr>
           <w:lang w:val="en-US"/>
         </w:rPr>
-        <w:t xml:space="preserve">Axis -&gt; </w:t>
-      </w:r>
-      <w:r>
-        <w:rPr>
-          <w:lang w:val="en-US"/>
-        </w:rPr>
-        <w:t xml:space="preserve"> Enc -&gt; Encoder Ev</w:t>
+        <w:t>Axis -</w:t>
+      </w:r>
+      <w:proofErr w:type="gramStart"/>
+      <w:r>
+        <w:rPr>
+          <w:lang w:val="en-US"/>
+        </w:rPr>
+        <w:t xml:space="preserve">&gt; </w:t>
+      </w:r>
+      <w:r>
+        <w:rPr>
+          <w:lang w:val="en-US"/>
+        </w:rPr>
+        <w:t xml:space="preserve"> Enc</w:t>
+      </w:r>
+      <w:proofErr w:type="gramEnd"/>
+      <w:r>
+        <w:rPr>
+          <w:lang w:val="en-US"/>
+        </w:rPr>
+        <w:t xml:space="preserve"> -&gt; Encoder Ev</w:t>
       </w:r>
       <w:r>
         <w:rPr>
@@ -808,7 +943,15 @@
         <w:spacing w:line="240" w:lineRule="auto"/>
       </w:pPr>
       <w:r>
-        <w:t>Terminal el7062-&gt;coe online tab-&gt;8010:39 ‘select info data 1’ data type digital inputs</w:t>
+        <w:t>Terminal el7062-&gt;</w:t>
+      </w:r>
+      <w:proofErr w:type="spellStart"/>
+      <w:r>
+        <w:t>coe</w:t>
+      </w:r>
+      <w:proofErr w:type="spellEnd"/>
+      <w:r>
+        <w:t xml:space="preserve"> online tab-&gt;8010:39 ‘select info data 1’ data type digital inputs</w:t>
       </w:r>
     </w:p>
     <w:p>
@@ -830,7 +973,39 @@
         <w:spacing w:line="240" w:lineRule="auto"/>
       </w:pPr>
       <w:r>
-        <w:t xml:space="preserve">Under i/o manager, el7062 terminal dropdown menu, drv infodata 1 channel 1, info data 1, link to.. -&gt; plc variable in this format </w:t>
+        <w:t xml:space="preserve">Under </w:t>
+      </w:r>
+      <w:proofErr w:type="spellStart"/>
+      <w:r>
+        <w:t>i</w:t>
+      </w:r>
+      <w:proofErr w:type="spellEnd"/>
+      <w:r>
+        <w:t xml:space="preserve">/o manager, el7062 terminal dropdown menu, </w:t>
+      </w:r>
+      <w:proofErr w:type="spellStart"/>
+      <w:r>
+        <w:t>drv</w:t>
+      </w:r>
+      <w:proofErr w:type="spellEnd"/>
+      <w:r>
+        <w:t xml:space="preserve"> </w:t>
+      </w:r>
+      <w:proofErr w:type="spellStart"/>
+      <w:r>
+        <w:t>infodata</w:t>
+      </w:r>
+      <w:proofErr w:type="spellEnd"/>
+      <w:r>
+        <w:t xml:space="preserve"> 1 channel 1, info data 1, link </w:t>
+      </w:r>
+      <w:proofErr w:type="gramStart"/>
+      <w:r>
+        <w:t>to..</w:t>
+      </w:r>
+      <w:proofErr w:type="gramEnd"/>
+      <w:r>
+        <w:t xml:space="preserve"> -&gt; plc variable in this format </w:t>
       </w:r>
       <w:r>
         <w:tab/>
@@ -842,50 +1017,111 @@
       <w:r>
         <w:tab/>
       </w:r>
+      <w:proofErr w:type="gramStart"/>
       <w:r>
         <w:tab/>
-        <w:t>:UINT;’</w:t>
-      </w:r>
-    </w:p>
-    <w:p>
-      <w:pPr>
-        <w:keepNext/>
-        <w:keepLines/>
-        <w:widowControl w:val="0"/>
-        <w:spacing w:line="240" w:lineRule="auto"/>
-      </w:pPr>
-      <w:r>
-        <w:t>Then do the same with drv infodata 1 channel 2</w:t>
-      </w:r>
-    </w:p>
-    <w:p>
-      <w:pPr>
-        <w:keepNext/>
-        <w:keepLines/>
-        <w:widowControl w:val="0"/>
-        <w:spacing w:line="240" w:lineRule="auto"/>
-      </w:pPr>
-      <w:r>
-        <w:t>The bits of these uint variables can be read as BOOL e.g. ‘xLimPos := InfoData1Ch1.0;’ (xLimPos is a BOOL type variable)</w:t>
-      </w:r>
-    </w:p>
-    <w:p>
-      <w:pPr>
-        <w:keepNext/>
-        <w:keepLines/>
-        <w:widowControl w:val="0"/>
-        <w:spacing w:line="240" w:lineRule="auto"/>
-      </w:pPr>
-    </w:p>
-    <w:p>
-      <w:pPr>
-        <w:keepNext/>
-        <w:keepLines/>
-        <w:widowControl w:val="0"/>
-        <w:spacing w:line="240" w:lineRule="auto"/>
-      </w:pPr>
-      <w:r>
-        <w:t>Terminal el7062-&gt;coe online tab-&gt;8001:0 ‘FB Touch Probe Settings Ch.1’</w:t>
+        <w:t>:UINT</w:t>
+      </w:r>
+      <w:proofErr w:type="gramEnd"/>
+      <w:r>
+        <w:t>;’</w:t>
+      </w:r>
+    </w:p>
+    <w:p>
+      <w:pPr>
+        <w:keepNext/>
+        <w:keepLines/>
+        <w:widowControl w:val="0"/>
+        <w:spacing w:line="240" w:lineRule="auto"/>
+      </w:pPr>
+      <w:r>
+        <w:t xml:space="preserve">Then do the same with </w:t>
+      </w:r>
+      <w:proofErr w:type="spellStart"/>
+      <w:r>
+        <w:t>drv</w:t>
+      </w:r>
+      <w:proofErr w:type="spellEnd"/>
+      <w:r>
+        <w:t xml:space="preserve"> </w:t>
+      </w:r>
+      <w:proofErr w:type="spellStart"/>
+      <w:r>
+        <w:t>infodata</w:t>
+      </w:r>
+      <w:proofErr w:type="spellEnd"/>
+      <w:r>
+        <w:t xml:space="preserve"> 1 channel 2</w:t>
+      </w:r>
+    </w:p>
+    <w:p>
+      <w:pPr>
+        <w:keepNext/>
+        <w:keepLines/>
+        <w:widowControl w:val="0"/>
+        <w:spacing w:line="240" w:lineRule="auto"/>
+      </w:pPr>
+      <w:r>
+        <w:t xml:space="preserve">The bits of these </w:t>
+      </w:r>
+      <w:proofErr w:type="spellStart"/>
+      <w:r>
+        <w:t>uint</w:t>
+      </w:r>
+      <w:proofErr w:type="spellEnd"/>
+      <w:r>
+        <w:t xml:space="preserve"> variables can be read as BOOL e.</w:t>
+      </w:r>
+      <w:proofErr w:type="gramStart"/>
+      <w:r>
+        <w:t>g. ‘</w:t>
+      </w:r>
+      <w:proofErr w:type="spellStart"/>
+      <w:r>
+        <w:t>xLimPos</w:t>
+      </w:r>
+      <w:proofErr w:type="spellEnd"/>
+      <w:r>
+        <w:t xml:space="preserve"> :</w:t>
+      </w:r>
+      <w:proofErr w:type="gramEnd"/>
+      <w:r>
+        <w:t>= InfoData1Ch1.0;’ (</w:t>
+      </w:r>
+      <w:proofErr w:type="spellStart"/>
+      <w:r>
+        <w:t>xLimPos</w:t>
+      </w:r>
+      <w:proofErr w:type="spellEnd"/>
+      <w:r>
+        <w:t xml:space="preserve"> is a BOOL type variable)</w:t>
+      </w:r>
+    </w:p>
+    <w:p>
+      <w:pPr>
+        <w:keepNext/>
+        <w:keepLines/>
+        <w:widowControl w:val="0"/>
+        <w:spacing w:line="240" w:lineRule="auto"/>
+      </w:pPr>
+    </w:p>
+    <w:p>
+      <w:pPr>
+        <w:keepNext/>
+        <w:keepLines/>
+        <w:widowControl w:val="0"/>
+        <w:spacing w:line="240" w:lineRule="auto"/>
+      </w:pPr>
+      <w:r>
+        <w:t>Terminal el7062-&gt;</w:t>
+      </w:r>
+      <w:proofErr w:type="spellStart"/>
+      <w:r>
+        <w:t>coe</w:t>
+      </w:r>
+      <w:proofErr w:type="spellEnd"/>
+      <w:r>
+        <w:t xml:space="preserve"> online tab-&gt;8001:0 ‘FB Touch Probe Settings Ch.1’</w:t>
       </w:r>
     </w:p>
     <w:p>
@@ -1129,7 +1365,15 @@
         <w:spacing w:line="240" w:lineRule="auto"/>
       </w:pPr>
       <w:r>
-        <w:t xml:space="preserve">These settings give the touch probe the zero sync pulse from the encoders for both channels. Need to reset linked axes in drive manager 2 as well as plc variable links for </w:t>
+        <w:t xml:space="preserve">These settings give the touch probe the </w:t>
+      </w:r>
+      <w:proofErr w:type="gramStart"/>
+      <w:r>
+        <w:t>zero sync</w:t>
+      </w:r>
+      <w:proofErr w:type="gramEnd"/>
+      <w:r>
+        <w:t xml:space="preserve"> pulse from the encoders for both channels. Need to reset linked axes in drive manager 2 as well as plc variable links for </w:t>
       </w:r>
     </w:p>
     <w:p>
@@ -1242,18 +1486,50 @@
         <w:spacing w:line="240" w:lineRule="auto"/>
       </w:pPr>
       <w:r>
-        <w:t>Taken from infosys-&gt;fieldbus components-&gt;ethercat plug-in modules-&gt;ej7411</w:t>
-      </w:r>
-    </w:p>
-    <w:p>
-      <w:pPr>
-        <w:keepNext/>
-        <w:keepLines/>
-        <w:widowControl w:val="0"/>
-        <w:spacing w:line="240" w:lineRule="auto"/>
-      </w:pPr>
-      <w:r>
-        <w:t>-&gt;ej7411 – commissioning-&gt;commissioning with the twincat nc-&gt;homing</w:t>
+        <w:t xml:space="preserve">Taken from </w:t>
+      </w:r>
+      <w:proofErr w:type="spellStart"/>
+      <w:r>
+        <w:t>infosys</w:t>
+      </w:r>
+      <w:proofErr w:type="spellEnd"/>
+      <w:r>
+        <w:t>-&gt;fieldbus components-&gt;</w:t>
+      </w:r>
+      <w:proofErr w:type="spellStart"/>
+      <w:r>
+        <w:t>ethercat</w:t>
+      </w:r>
+      <w:proofErr w:type="spellEnd"/>
+      <w:r>
+        <w:t xml:space="preserve"> plug-in modules-&gt;ej7411</w:t>
+      </w:r>
+    </w:p>
+    <w:p>
+      <w:pPr>
+        <w:keepNext/>
+        <w:keepLines/>
+        <w:widowControl w:val="0"/>
+        <w:spacing w:line="240" w:lineRule="auto"/>
+      </w:pPr>
+      <w:r>
+        <w:t xml:space="preserve">-&gt;ej7411 – commissioning-&gt;commissioning with the </w:t>
+      </w:r>
+      <w:proofErr w:type="spellStart"/>
+      <w:r>
+        <w:t>twincat</w:t>
+      </w:r>
+      <w:proofErr w:type="spellEnd"/>
+      <w:r>
+        <w:t xml:space="preserve"> </w:t>
+      </w:r>
+      <w:proofErr w:type="spellStart"/>
+      <w:r>
+        <w:t>nc</w:t>
+      </w:r>
+      <w:proofErr w:type="spellEnd"/>
+      <w:r>
+        <w:t>-&gt;homing</w:t>
       </w:r>
     </w:p>
     <w:p>
@@ -1358,10 +1634,26 @@
         <w:spacing w:line="240" w:lineRule="auto"/>
       </w:pPr>
       <w:r>
-        <w:t>Carriage offsets to massa head</w:t>
-      </w:r>
-      <w:r>
-        <w:t xml:space="preserve"> and keyence head</w:t>
+        <w:t xml:space="preserve">Carriage offsets to </w:t>
+      </w:r>
+      <w:proofErr w:type="spellStart"/>
+      <w:r>
+        <w:t>massa</w:t>
+      </w:r>
+      <w:proofErr w:type="spellEnd"/>
+      <w:r>
+        <w:t xml:space="preserve"> head</w:t>
+      </w:r>
+      <w:r>
+        <w:t xml:space="preserve"> and </w:t>
+      </w:r>
+      <w:proofErr w:type="spellStart"/>
+      <w:r>
+        <w:t>keyence</w:t>
+      </w:r>
+      <w:proofErr w:type="spellEnd"/>
+      <w:r>
+        <w:t xml:space="preserve"> head</w:t>
       </w:r>
     </w:p>
     <w:p>
@@ -1385,22 +1677,48 @@
       <w:r>
         <w:t xml:space="preserve">Test </w:t>
       </w:r>
+      <w:proofErr w:type="spellStart"/>
       <w:r>
         <w:t>keyence</w:t>
       </w:r>
-      <w:r>
-        <w:t xml:space="preserve"> and axis daq accuracy </w:t>
-      </w:r>
-    </w:p>
-    <w:p>
-      <w:pPr>
-        <w:keepNext/>
-        <w:keepLines/>
-        <w:widowControl w:val="0"/>
-        <w:spacing w:line="240" w:lineRule="auto"/>
-      </w:pPr>
-      <w:r>
-        <w:t>Test mqtt control for daq with both int and bool ctr signals</w:t>
+      <w:proofErr w:type="spellEnd"/>
+      <w:r>
+        <w:t xml:space="preserve"> and axis </w:t>
+      </w:r>
+      <w:proofErr w:type="spellStart"/>
+      <w:r>
+        <w:t>daq</w:t>
+      </w:r>
+      <w:proofErr w:type="spellEnd"/>
+      <w:r>
+        <w:t xml:space="preserve"> accuracy </w:t>
+      </w:r>
+    </w:p>
+    <w:p>
+      <w:pPr>
+        <w:keepNext/>
+        <w:keepLines/>
+        <w:widowControl w:val="0"/>
+        <w:spacing w:line="240" w:lineRule="auto"/>
+      </w:pPr>
+      <w:r>
+        <w:t xml:space="preserve">Test </w:t>
+      </w:r>
+      <w:proofErr w:type="spellStart"/>
+      <w:r>
+        <w:t>mqtt</w:t>
+      </w:r>
+      <w:proofErr w:type="spellEnd"/>
+      <w:r>
+        <w:t xml:space="preserve"> control for </w:t>
+      </w:r>
+      <w:proofErr w:type="spellStart"/>
+      <w:r>
+        <w:t>daq</w:t>
+      </w:r>
+      <w:proofErr w:type="spellEnd"/>
+      <w:r>
+        <w:t xml:space="preserve"> with both int and bool ctr signals</w:t>
       </w:r>
     </w:p>
     <w:p>
@@ -1422,7 +1740,13 @@
         <w:t xml:space="preserve">Header – </w:t>
       </w:r>
       <w:r>
-        <w:t xml:space="preserve">sensor, script name, </w:t>
+        <w:t>script name,</w:t>
+      </w:r>
+      <w:r>
+        <w:t xml:space="preserve"> sensor,</w:t>
+      </w:r>
+      <w:r>
+        <w:t xml:space="preserve"> </w:t>
       </w:r>
       <w:r>
         <w:t>sensor offsets,</w:t>
@@ -1434,17 +1758,34 @@
         <w:t xml:space="preserve"> </w:t>
       </w:r>
       <w:r>
-        <w:t xml:space="preserve">continuous mode, number </w:t>
-      </w:r>
-      <w:r>
-        <w:t xml:space="preserve">script </w:t>
-      </w:r>
-      <w:r>
-        <w:t>runs</w:t>
-      </w:r>
-      <w:r>
-        <w:t xml:space="preserve">, run time, </w:t>
-      </w:r>
+        <w:t>continuous mode, number</w:t>
+      </w:r>
+      <w:r>
+        <w:t xml:space="preserve"> </w:t>
+      </w:r>
+      <w:r>
+        <w:t>script</w:t>
+      </w:r>
+      <w:r>
+        <w:t xml:space="preserve"> r</w:t>
+      </w:r>
+      <w:r>
+        <w:t>uns</w:t>
+      </w:r>
+      <w:r>
+        <w:t>,</w:t>
+      </w:r>
+      <w:r>
+        <w:t xml:space="preserve"> acquire every x</w:t>
+      </w:r>
+    </w:p>
+    <w:p>
+      <w:pPr>
+        <w:keepNext/>
+        <w:keepLines/>
+        <w:widowControl w:val="0"/>
+        <w:spacing w:line="240" w:lineRule="auto"/>
+      </w:pPr>
       <w:r>
         <w:t>(</w:t>
       </w:r>
@@ -1466,7 +1807,23 @@
         <w:t>(</w:t>
       </w:r>
       <w:r>
-        <w:t>For each sensor – attached to x or xy or xyz or none</w:t>
+        <w:t xml:space="preserve">For each sensor – attached to x or </w:t>
+      </w:r>
+      <w:proofErr w:type="spellStart"/>
+      <w:r>
+        <w:t>xy</w:t>
+      </w:r>
+      <w:proofErr w:type="spellEnd"/>
+      <w:r>
+        <w:t xml:space="preserve"> or </w:t>
+      </w:r>
+      <w:proofErr w:type="spellStart"/>
+      <w:r>
+        <w:t>xyz</w:t>
+      </w:r>
+      <w:proofErr w:type="spellEnd"/>
+      <w:r>
+        <w:t xml:space="preserve"> or none</w:t>
       </w:r>
       <w:r>
         <w:t xml:space="preserve">?) </w:t>
@@ -1488,7 +1845,26 @@
         <w:spacing w:line="240" w:lineRule="auto"/>
       </w:pPr>
       <w:r>
-        <w:t>Data – pass number, timestamp, x,y,z, sensor</w:t>
+        <w:t>Data – pass number,</w:t>
+      </w:r>
+      <w:r>
+        <w:t xml:space="preserve"> pass runtime,</w:t>
+      </w:r>
+      <w:r>
+        <w:t xml:space="preserve"> timestamp, </w:t>
+      </w:r>
+      <w:proofErr w:type="spellStart"/>
+      <w:proofErr w:type="gramStart"/>
+      <w:r>
+        <w:t>x,y</w:t>
+      </w:r>
+      <w:proofErr w:type="gramEnd"/>
+      <w:r>
+        <w:t>,z</w:t>
+      </w:r>
+      <w:proofErr w:type="spellEnd"/>
+      <w:r>
+        <w:t>, sensor</w:t>
       </w:r>
     </w:p>
     <w:p>
@@ -1534,7 +1910,15 @@
         <w:spacing w:line="240" w:lineRule="auto"/>
       </w:pPr>
       <w:r>
-        <w:t>Force no movement for time based daq trigger</w:t>
+        <w:t xml:space="preserve">Force no movement for time based </w:t>
+      </w:r>
+      <w:proofErr w:type="spellStart"/>
+      <w:r>
+        <w:t>daq</w:t>
+      </w:r>
+      <w:proofErr w:type="spellEnd"/>
+      <w:r>
+        <w:t xml:space="preserve"> trigger</w:t>
       </w:r>
     </w:p>
     <w:p>
@@ -1701,9 +2085,11 @@
       <w:r>
         <w:t xml:space="preserve"> - </w:t>
       </w:r>
+      <w:proofErr w:type="spellStart"/>
       <w:r>
         <w:t>MC_ExtSetPointGenEnable</w:t>
       </w:r>
+      <w:proofErr w:type="spellEnd"/>
     </w:p>
     <w:p>
       <w:pPr>
@@ -1732,18 +2118,34 @@
         <w:spacing w:line="240" w:lineRule="auto"/>
       </w:pPr>
       <w:r>
-        <w:t xml:space="preserve">    nVarPers1 : DINT; (* 1. Persistent variable *)</w:t>
-      </w:r>
-    </w:p>
-    <w:p>
-      <w:pPr>
-        <w:keepNext/>
-        <w:keepLines/>
-        <w:widowControl w:val="0"/>
-        <w:spacing w:line="240" w:lineRule="auto"/>
-      </w:pPr>
-      <w:r>
-        <w:t xml:space="preserve">    bVarPers2 : BOOL; (* 2. Persistent variable *)</w:t>
+        <w:t xml:space="preserve">    nVarPers</w:t>
+      </w:r>
+      <w:proofErr w:type="gramStart"/>
+      <w:r>
+        <w:t>1 :</w:t>
+      </w:r>
+      <w:proofErr w:type="gramEnd"/>
+      <w:r>
+        <w:t xml:space="preserve"> DINT; (* 1. Persistent variable *)</w:t>
+      </w:r>
+    </w:p>
+    <w:p>
+      <w:pPr>
+        <w:keepNext/>
+        <w:keepLines/>
+        <w:widowControl w:val="0"/>
+        <w:spacing w:line="240" w:lineRule="auto"/>
+      </w:pPr>
+      <w:r>
+        <w:t xml:space="preserve">    bVarPers</w:t>
+      </w:r>
+      <w:proofErr w:type="gramStart"/>
+      <w:r>
+        <w:t>2 :</w:t>
+      </w:r>
+      <w:proofErr w:type="gramEnd"/>
+      <w:r>
+        <w:t xml:space="preserve"> BOOL; (* 2. Persistent variable *)</w:t>
       </w:r>
     </w:p>
     <w:p>
@@ -1778,9 +2180,11 @@
       <w:r>
         <w:t xml:space="preserve"> - </w:t>
       </w:r>
+      <w:proofErr w:type="spellStart"/>
       <w:r>
         <w:t>FB_WritePersistentData</w:t>
       </w:r>
+      <w:proofErr w:type="spellEnd"/>
     </w:p>
     <w:p>
       <w:pPr>
@@ -1947,7 +2351,23 @@
         <w:spacing w:line="240" w:lineRule="auto"/>
       </w:pPr>
       <w:r>
-        <w:t>1.Mc_home has no bcalibrationcam input - must be set at CoE object</w:t>
+        <w:t xml:space="preserve">1.Mc_home has no </w:t>
+      </w:r>
+      <w:proofErr w:type="spellStart"/>
+      <w:r>
+        <w:t>bcalibrationcam</w:t>
+      </w:r>
+      <w:proofErr w:type="spellEnd"/>
+      <w:r>
+        <w:t xml:space="preserve"> input - must be set at </w:t>
+      </w:r>
+      <w:proofErr w:type="spellStart"/>
+      <w:r>
+        <w:t>CoE</w:t>
+      </w:r>
+      <w:proofErr w:type="spellEnd"/>
+      <w:r>
+        <w:t xml:space="preserve"> object</w:t>
       </w:r>
     </w:p>
     <w:p>
@@ -1969,7 +2389,15 @@
         <w:spacing w:line="240" w:lineRule="auto"/>
       </w:pPr>
       <w:r>
-        <w:t>2. Motion fbs need acceleration inputs, not default</w:t>
+        <w:t xml:space="preserve">2. Motion </w:t>
+      </w:r>
+      <w:proofErr w:type="spellStart"/>
+      <w:r>
+        <w:t>fbs</w:t>
+      </w:r>
+      <w:proofErr w:type="spellEnd"/>
+      <w:r>
+        <w:t xml:space="preserve"> need acceleration inputs, not default</w:t>
       </w:r>
     </w:p>
     <w:p>
@@ -2021,7 +2449,15 @@
         <w:spacing w:line="240" w:lineRule="auto"/>
       </w:pPr>
       <w:r>
-        <w:t>Program can only have once instance</w:t>
+        <w:t xml:space="preserve">Program can only have </w:t>
+      </w:r>
+      <w:proofErr w:type="gramStart"/>
+      <w:r>
+        <w:t>once</w:t>
+      </w:r>
+      <w:proofErr w:type="gramEnd"/>
+      <w:r>
+        <w:t xml:space="preserve"> instance</w:t>
       </w:r>
     </w:p>
     <w:p>
@@ -2076,7 +2512,15 @@
         <w:spacing w:line="240" w:lineRule="auto"/>
       </w:pPr>
       <w:r>
-        <w:t>Safe z is the lower limit for z-&gt; can only go below while there is no xy motion</w:t>
+        <w:t xml:space="preserve">Safe z is the lower limit for z-&gt; can only go below while there is no </w:t>
+      </w:r>
+      <w:proofErr w:type="spellStart"/>
+      <w:r>
+        <w:t>xy</w:t>
+      </w:r>
+      <w:proofErr w:type="spellEnd"/>
+      <w:r>
+        <w:t xml:space="preserve"> motion</w:t>
       </w:r>
     </w:p>
     <w:p>
@@ -2098,19 +2542,37 @@
         <w:spacing w:line="240" w:lineRule="auto"/>
       </w:pPr>
       <w:r>
-        <w:t>Skim water surface -&gt; feedback from massa, sonar for daq</w:t>
-      </w:r>
-    </w:p>
-    <w:p>
-      <w:pPr>
-        <w:keepNext/>
-        <w:keepLines/>
-        <w:widowControl w:val="0"/>
-        <w:spacing w:line="240" w:lineRule="auto"/>
-      </w:pPr>
-      <w:r>
-        <w:t>Follow sediment -&gt; feedback from sonar, sonar for daq</w:t>
-      </w:r>
+        <w:t xml:space="preserve">Skim water surface -&gt; feedback from </w:t>
+      </w:r>
+      <w:proofErr w:type="spellStart"/>
+      <w:r>
+        <w:t>massa</w:t>
+      </w:r>
+      <w:proofErr w:type="spellEnd"/>
+      <w:r>
+        <w:t xml:space="preserve">, sonar for </w:t>
+      </w:r>
+      <w:proofErr w:type="spellStart"/>
+      <w:r>
+        <w:t>daq</w:t>
+      </w:r>
+      <w:proofErr w:type="spellEnd"/>
+    </w:p>
+    <w:p>
+      <w:pPr>
+        <w:keepNext/>
+        <w:keepLines/>
+        <w:widowControl w:val="0"/>
+        <w:spacing w:line="240" w:lineRule="auto"/>
+      </w:pPr>
+      <w:r>
+        <w:t xml:space="preserve">Follow sediment -&gt; feedback from sonar, sonar for </w:t>
+      </w:r>
+      <w:proofErr w:type="spellStart"/>
+      <w:r>
+        <w:t>daq</w:t>
+      </w:r>
+      <w:proofErr w:type="spellEnd"/>
     </w:p>
     <w:p>
       <w:pPr>
@@ -2200,7 +2662,23 @@
         <w:spacing w:line="240" w:lineRule="auto"/>
       </w:pPr>
       <w:r>
-        <w:t>Reset drive manager hw and reestablish variable link for latch encoder inputs</w:t>
+        <w:t xml:space="preserve">Reset drive manager </w:t>
+      </w:r>
+      <w:proofErr w:type="spellStart"/>
+      <w:r>
+        <w:t>hw</w:t>
+      </w:r>
+      <w:proofErr w:type="spellEnd"/>
+      <w:r>
+        <w:t xml:space="preserve"> and </w:t>
+      </w:r>
+      <w:proofErr w:type="gramStart"/>
+      <w:r>
+        <w:t>reestablish</w:t>
+      </w:r>
+      <w:proofErr w:type="gramEnd"/>
+      <w:r>
+        <w:t xml:space="preserve"> variable link for latch encoder inputs</w:t>
       </w:r>
     </w:p>
     <w:p>
@@ -2238,7 +2716,15 @@
         <w:spacing w:line="240" w:lineRule="auto"/>
       </w:pPr>
       <w:r>
-        <w:t>Mqtt is in‘TC3_IotBase’</w:t>
+        <w:t xml:space="preserve">Mqtt is </w:t>
+      </w:r>
+      <w:proofErr w:type="gramStart"/>
+      <w:r>
+        <w:t>in‘</w:t>
+      </w:r>
+      <w:proofErr w:type="gramEnd"/>
+      <w:r>
+        <w:t>TC3_IotBase’</w:t>
       </w:r>
     </w:p>
     <w:p>
@@ -2318,14 +2804,70 @@
           <w:lang w:val="en-US"/>
         </w:rPr>
         <w:br/>
-        <w:t>    MeasureStart    : T_DCTIME64;</w:t>
+        <w:t>    </w:t>
+      </w:r>
+      <w:proofErr w:type="spellStart"/>
+      <w:r>
+        <w:rPr>
+          <w:lang w:val="en-US"/>
+        </w:rPr>
+        <w:t>MeasureStart</w:t>
+      </w:r>
+      <w:proofErr w:type="spellEnd"/>
+      <w:r>
+        <w:rPr>
+          <w:lang w:val="en-US"/>
+        </w:rPr>
+        <w:t>  </w:t>
+      </w:r>
+      <w:proofErr w:type="gramStart"/>
+      <w:r>
+        <w:rPr>
+          <w:lang w:val="en-US"/>
+        </w:rPr>
+        <w:t>  :</w:t>
+      </w:r>
+      <w:proofErr w:type="gramEnd"/>
+      <w:r>
+        <w:rPr>
+          <w:lang w:val="en-US"/>
+        </w:rPr>
+        <w:t xml:space="preserve"> T_DCTIME64;</w:t>
       </w:r>
       <w:r>
         <w:rPr>
           <w:lang w:val="en-US"/>
         </w:rPr>
         <w:br/>
-        <w:t>    MeasureResult   : T_DCTIME64;</w:t>
+        <w:t>    </w:t>
+      </w:r>
+      <w:proofErr w:type="spellStart"/>
+      <w:r>
+        <w:rPr>
+          <w:lang w:val="en-US"/>
+        </w:rPr>
+        <w:t>MeasureResult</w:t>
+      </w:r>
+      <w:proofErr w:type="spellEnd"/>
+      <w:r>
+        <w:rPr>
+          <w:lang w:val="en-US"/>
+        </w:rPr>
+        <w:t> </w:t>
+      </w:r>
+      <w:proofErr w:type="gramStart"/>
+      <w:r>
+        <w:rPr>
+          <w:lang w:val="en-US"/>
+        </w:rPr>
+        <w:t>  :</w:t>
+      </w:r>
+      <w:proofErr w:type="gramEnd"/>
+      <w:r>
+        <w:rPr>
+          <w:lang w:val="en-US"/>
+        </w:rPr>
+        <w:t xml:space="preserve"> T_DCTIME64;</w:t>
       </w:r>
       <w:r>
         <w:rPr>
@@ -2352,7 +2894,42 @@
           <w:lang w:val="en-US"/>
         </w:rPr>
         <w:br/>
-        <w:t xml:space="preserve">MeasureStart:=F_GetActualDcTime64(); </w:t>
+      </w:r>
+      <w:proofErr w:type="spellStart"/>
+      <w:proofErr w:type="gramStart"/>
+      <w:r>
+        <w:rPr>
+          <w:lang w:val="en-US"/>
+        </w:rPr>
+        <w:t>MeasureStart</w:t>
+      </w:r>
+      <w:proofErr w:type="spellEnd"/>
+      <w:r>
+        <w:rPr>
+          <w:lang w:val="en-US"/>
+        </w:rPr>
+        <w:t>:=</w:t>
+      </w:r>
+      <w:proofErr w:type="gramEnd"/>
+      <w:r>
+        <w:rPr>
+          <w:lang w:val="en-US"/>
+        </w:rPr>
+        <w:t>F_GetActualDcTime64(</w:t>
+      </w:r>
+      <w:proofErr w:type="gramStart"/>
+      <w:r>
+        <w:rPr>
+          <w:lang w:val="en-US"/>
+        </w:rPr>
+        <w:t>);</w:t>
+      </w:r>
+      <w:proofErr w:type="gramEnd"/>
+      <w:r>
+        <w:rPr>
+          <w:lang w:val="en-US"/>
+        </w:rPr>
+        <w:t xml:space="preserve"> </w:t>
       </w:r>
     </w:p>
     <w:p>
@@ -2376,8 +2953,45 @@
           <w:lang w:val="en-US"/>
         </w:rPr>
         <w:br/>
-        <w:t>MeasureResult:=F_GetActualDcTime64()-MeasureStart;</w:t>
-      </w:r>
+      </w:r>
+      <w:proofErr w:type="spellStart"/>
+      <w:proofErr w:type="gramStart"/>
+      <w:r>
+        <w:rPr>
+          <w:lang w:val="en-US"/>
+        </w:rPr>
+        <w:t>MeasureResult</w:t>
+      </w:r>
+      <w:proofErr w:type="spellEnd"/>
+      <w:r>
+        <w:rPr>
+          <w:lang w:val="en-US"/>
+        </w:rPr>
+        <w:t>:=</w:t>
+      </w:r>
+      <w:proofErr w:type="gramEnd"/>
+      <w:r>
+        <w:rPr>
+          <w:lang w:val="en-US"/>
+        </w:rPr>
+        <w:t>F_GetActualDcTime64()-</w:t>
+      </w:r>
+      <w:proofErr w:type="spellStart"/>
+      <w:proofErr w:type="gramStart"/>
+      <w:r>
+        <w:rPr>
+          <w:lang w:val="en-US"/>
+        </w:rPr>
+        <w:t>MeasureStart</w:t>
+      </w:r>
+      <w:proofErr w:type="spellEnd"/>
+      <w:r>
+        <w:rPr>
+          <w:lang w:val="en-US"/>
+        </w:rPr>
+        <w:t>;</w:t>
+      </w:r>
+      <w:proofErr w:type="gramEnd"/>
     </w:p>
     <w:p>
       <w:pPr>

</xml_diff>

<commit_message>
labels for external control variables and more script read logic
</commit_message>
<xml_diff>
--- a/Beckhoff PLC Commissioning document.docx
+++ b/Beckhoff PLC Commissioning document.docx
@@ -1869,7 +1869,10 @@
         <w:spacing w:line="240" w:lineRule="auto"/>
       </w:pPr>
       <w:r>
-        <w:t>Visual basin space placing sensors</w:t>
+        <w:t xml:space="preserve">Define basin – put in header, clear script? </w:t>
+      </w:r>
+      <w:r>
+        <w:t>Should entered coordinates be in basin space or normal? Output data file to basin coordinates</w:t>
       </w:r>
     </w:p>
     <w:p>
@@ -3082,6 +3085,7 @@
   <w:style w:type="character" w:default="1" w:styleId="DefaultParagraphFont">
     <w:name w:val="Default Paragraph Font"/>
     <w:uiPriority w:val="1"/>
+    <w:semiHidden/>
     <w:unhideWhenUsed/>
   </w:style>
   <w:style w:type="table" w:default="1" w:styleId="TableNormal">

</xml_diff>

<commit_message>
position checks against limits
</commit_message>
<xml_diff>
--- a/Beckhoff PLC Commissioning document.docx
+++ b/Beckhoff PLC Commissioning document.docx
@@ -1215,6 +1215,41 @@
         </w:rPr>
         <w:t>‘Reference Mode (Sync Condition)’ set to ‘Hardware Sync (feedback reference pulse)’</w:t>
       </w:r>
+      <w:r>
+        <w:rPr>
+          <w:b/>
+          <w:bCs/>
+        </w:rPr>
+        <w:t xml:space="preserve"> (</w:t>
+      </w:r>
+      <w:r>
+        <w:rPr>
+          <w:b/>
+          <w:bCs/>
+        </w:rPr>
+        <w:t>‘</w:t>
+      </w:r>
+      <w:r>
+        <w:rPr>
+          <w:b/>
+          <w:bCs/>
+        </w:rPr>
+        <w:t>default</w:t>
+      </w:r>
+      <w:r>
+        <w:rPr>
+          <w:b/>
+          <w:bCs/>
+        </w:rPr>
+        <w:t>’</w:t>
+      </w:r>
+      <w:r>
+        <w:rPr>
+          <w:b/>
+          <w:bCs/>
+        </w:rPr>
+        <w:t xml:space="preserve"> backs off switch set amount)</w:t>
+      </w:r>
     </w:p>
     <w:p>
       <w:pPr>
@@ -1346,11 +1381,20 @@
         <w:keepLines/>
         <w:widowControl w:val="0"/>
         <w:spacing w:line="240" w:lineRule="auto"/>
-      </w:pPr>
-      <w:r>
+        <w:rPr>
+          <w:strike/>
+        </w:rPr>
+      </w:pPr>
+      <w:r>
+        <w:rPr>
+          <w:strike/>
+        </w:rPr>
         <w:t>Carriage offsets to massa head</w:t>
       </w:r>
       <w:r>
+        <w:rPr>
+          <w:strike/>
+        </w:rPr>
         <w:t xml:space="preserve"> and keyence head</w:t>
       </w:r>
     </w:p>
@@ -1407,47 +1451,92 @@
         <w:keepLines/>
         <w:widowControl w:val="0"/>
         <w:spacing w:line="240" w:lineRule="auto"/>
-      </w:pPr>
-      <w:r>
+        <w:rPr>
+          <w:strike/>
+        </w:rPr>
+      </w:pPr>
+      <w:r>
+        <w:rPr>
+          <w:strike/>
+        </w:rPr>
         <w:t xml:space="preserve">Header – </w:t>
       </w:r>
       <w:r>
+        <w:rPr>
+          <w:strike/>
+        </w:rPr>
         <w:t>script name,</w:t>
       </w:r>
       <w:r>
+        <w:rPr>
+          <w:strike/>
+        </w:rPr>
         <w:t xml:space="preserve"> sensor,</w:t>
       </w:r>
       <w:r>
+        <w:rPr>
+          <w:strike/>
+        </w:rPr>
         <w:t xml:space="preserve"> </w:t>
       </w:r>
       <w:r>
+        <w:rPr>
+          <w:strike/>
+        </w:rPr>
         <w:t>sensor offsets,</w:t>
       </w:r>
       <w:r>
+        <w:rPr>
+          <w:strike/>
+        </w:rPr>
         <w:t xml:space="preserve"> trigger type,</w:t>
       </w:r>
       <w:r>
+        <w:rPr>
+          <w:strike/>
+        </w:rPr>
         <w:t xml:space="preserve"> </w:t>
       </w:r>
       <w:r>
+        <w:rPr>
+          <w:strike/>
+        </w:rPr>
         <w:t>continuous mode, number</w:t>
       </w:r>
       <w:r>
+        <w:rPr>
+          <w:strike/>
+        </w:rPr>
         <w:t xml:space="preserve"> </w:t>
       </w:r>
       <w:r>
+        <w:rPr>
+          <w:strike/>
+        </w:rPr>
         <w:t>script</w:t>
       </w:r>
       <w:r>
+        <w:rPr>
+          <w:strike/>
+        </w:rPr>
         <w:t xml:space="preserve"> r</w:t>
       </w:r>
       <w:r>
+        <w:rPr>
+          <w:strike/>
+        </w:rPr>
         <w:t>uns</w:t>
       </w:r>
       <w:r>
+        <w:rPr>
+          <w:strike/>
+        </w:rPr>
         <w:t>,</w:t>
       </w:r>
       <w:r>
+        <w:rPr>
+          <w:strike/>
+        </w:rPr>
         <w:t xml:space="preserve"> acquire every x</w:t>
       </w:r>
     </w:p>
@@ -1499,14 +1588,26 @@
         <w:keepLines/>
         <w:widowControl w:val="0"/>
         <w:spacing w:line="240" w:lineRule="auto"/>
-      </w:pPr>
-      <w:r>
+        <w:rPr>
+          <w:strike/>
+        </w:rPr>
+      </w:pPr>
+      <w:r>
+        <w:rPr>
+          <w:strike/>
+        </w:rPr>
         <w:t>Data – pass number,</w:t>
       </w:r>
       <w:r>
+        <w:rPr>
+          <w:strike/>
+        </w:rPr>
         <w:t xml:space="preserve"> pass runtime,</w:t>
       </w:r>
       <w:r>
+        <w:rPr>
+          <w:strike/>
+        </w:rPr>
         <w:t xml:space="preserve"> timestamp, x,y,z, sensor</w:t>
       </w:r>
     </w:p>
@@ -1524,6 +1625,31 @@
         <w:keepLines/>
         <w:widowControl w:val="0"/>
         <w:spacing w:line="240" w:lineRule="auto"/>
+        <w:rPr>
+          <w:strike/>
+        </w:rPr>
+      </w:pPr>
+      <w:r>
+        <w:rPr>
+          <w:strike/>
+        </w:rPr>
+        <w:t>Mqtt broadcast topic for all status variables</w:t>
+      </w:r>
+    </w:p>
+    <w:p>
+      <w:pPr>
+        <w:keepNext/>
+        <w:keepLines/>
+        <w:widowControl w:val="0"/>
+        <w:spacing w:line="240" w:lineRule="auto"/>
+      </w:pPr>
+    </w:p>
+    <w:p>
+      <w:pPr>
+        <w:keepNext/>
+        <w:keepLines/>
+        <w:widowControl w:val="0"/>
+        <w:spacing w:line="240" w:lineRule="auto"/>
       </w:pPr>
       <w:r>
         <w:t>Homing routine – 2 switches, drive coupled. Detect which is hit first or if they are both hit.</w:t>
@@ -2397,7 +2523,32 @@
           <w:b/>
           <w:bCs/>
         </w:rPr>
-        <w:t>MQTT:</w:t>
+        <w:t>MQTT</w:t>
+      </w:r>
+      <w:r>
+        <w:rPr>
+          <w:b/>
+          <w:bCs/>
+        </w:rPr>
+        <w:t>/Libraries</w:t>
+      </w:r>
+      <w:r>
+        <w:rPr>
+          <w:b/>
+          <w:bCs/>
+        </w:rPr>
+        <w:t>:</w:t>
+      </w:r>
+    </w:p>
+    <w:p>
+      <w:pPr>
+        <w:keepNext/>
+        <w:keepLines/>
+        <w:widowControl w:val="0"/>
+        <w:spacing w:line="240" w:lineRule="auto"/>
+      </w:pPr>
+      <w:r>
+        <w:t>MQTT QOS currently set to at most once message send</w:t>
       </w:r>
     </w:p>
     <w:p>
@@ -2434,6 +2585,17 @@
       </w:r>
       <w:r>
         <w:t>3_JsonXML’</w:t>
+      </w:r>
+    </w:p>
+    <w:p>
+      <w:pPr>
+        <w:keepNext/>
+        <w:keepLines/>
+        <w:widowControl w:val="0"/>
+        <w:spacing w:line="240" w:lineRule="auto"/>
+      </w:pPr>
+      <w:r>
+        <w:t>FB_S_UPS_BAPI_0 (write persistent data on power loss) in library Tc2_SUPS (download in pkg manager)</w:t>
       </w:r>
     </w:p>
     <w:p>

</xml_diff>

<commit_message>
work on basin controls
</commit_message>
<xml_diff>
--- a/Beckhoff PLC Commissioning document.docx
+++ b/Beckhoff PLC Commissioning document.docx
@@ -612,6 +612,29 @@
         <w:widowControl w:val="0"/>
         <w:spacing w:line="240" w:lineRule="auto"/>
       </w:pPr>
+      <w:r>
+        <w:t>String function</w:t>
+      </w:r>
+      <w:r>
+        <w:t>s</w:t>
+      </w:r>
+      <w:r>
+        <w:t xml:space="preserve"> FIND2, LEN2</w:t>
+      </w:r>
+      <w:r>
+        <w:t xml:space="preserve"> etc</w:t>
+      </w:r>
+      <w:r>
+        <w:t xml:space="preserve"> used for strings longer than 255 char</w:t>
+      </w:r>
+    </w:p>
+    <w:p>
+      <w:pPr>
+        <w:keepNext/>
+        <w:keepLines/>
+        <w:widowControl w:val="0"/>
+        <w:spacing w:line="240" w:lineRule="auto"/>
+      </w:pPr>
     </w:p>
     <w:p>
       <w:pPr>
@@ -1248,6 +1271,13 @@
           <w:b/>
           <w:bCs/>
         </w:rPr>
+        <w:t>3</w:t>
+      </w:r>
+      <w:r>
+        <w:rPr>
+          <w:b/>
+          <w:bCs/>
+        </w:rPr>
         <w:t xml:space="preserve"> backs off switch set amount)</w:t>
       </w:r>
     </w:p>
@@ -1642,6 +1672,28 @@
         <w:keepLines/>
         <w:widowControl w:val="0"/>
         <w:spacing w:line="240" w:lineRule="auto"/>
+        <w:rPr>
+          <w:strike/>
+        </w:rPr>
+      </w:pPr>
+    </w:p>
+    <w:p>
+      <w:pPr>
+        <w:keepNext/>
+        <w:keepLines/>
+        <w:widowControl w:val="0"/>
+        <w:spacing w:line="240" w:lineRule="auto"/>
+      </w:pPr>
+      <w:r>
+        <w:t xml:space="preserve">Documentation on all variables and read/write </w:t>
+      </w:r>
+    </w:p>
+    <w:p>
+      <w:pPr>
+        <w:keepNext/>
+        <w:keepLines/>
+        <w:widowControl w:val="0"/>
+        <w:spacing w:line="240" w:lineRule="auto"/>
       </w:pPr>
     </w:p>
     <w:p>
@@ -1761,70 +1813,6 @@
         <w:spacing w:line="240" w:lineRule="auto"/>
       </w:pPr>
       <w:r>
-        <w:t xml:space="preserve">Continuous mode </w:t>
-      </w:r>
-      <w:r>
-        <w:t xml:space="preserve">– override append mode </w:t>
-      </w:r>
-      <w:r>
-        <w:t>– force new file each run</w:t>
-      </w:r>
-      <w:r>
-        <w:t xml:space="preserve"> – pass index resets for each file</w:t>
-      </w:r>
-    </w:p>
-    <w:p>
-      <w:pPr>
-        <w:keepNext/>
-        <w:keepLines/>
-        <w:widowControl w:val="0"/>
-        <w:spacing w:line="240" w:lineRule="auto"/>
-      </w:pPr>
-      <w:r>
-        <w:t xml:space="preserve">Append </w:t>
-      </w:r>
-      <w:r>
-        <w:t>mode – pass index keeps incrementing</w:t>
-      </w:r>
-      <w:r>
-        <w:t xml:space="preserve"> and resets at the end of a finite number of script runs</w:t>
-      </w:r>
-    </w:p>
-    <w:p>
-      <w:pPr>
-        <w:keepNext/>
-        <w:keepLines/>
-        <w:widowControl w:val="0"/>
-        <w:spacing w:line="240" w:lineRule="auto"/>
-      </w:pPr>
-    </w:p>
-    <w:p>
-      <w:pPr>
-        <w:keepNext/>
-        <w:keepLines/>
-        <w:widowControl w:val="0"/>
-        <w:spacing w:line="240" w:lineRule="auto"/>
-      </w:pPr>
-      <w:r>
-        <w:t>Assess plc and task cycle times</w:t>
-      </w:r>
-    </w:p>
-    <w:p>
-      <w:pPr>
-        <w:keepNext/>
-        <w:keepLines/>
-        <w:widowControl w:val="0"/>
-        <w:spacing w:line="240" w:lineRule="auto"/>
-      </w:pPr>
-    </w:p>
-    <w:p>
-      <w:pPr>
-        <w:keepNext/>
-        <w:keepLines/>
-        <w:widowControl w:val="0"/>
-        <w:spacing w:line="240" w:lineRule="auto"/>
-      </w:pPr>
-      <w:r>
         <w:t>Lock control panel during run</w:t>
       </w:r>
     </w:p>
@@ -1842,8 +1830,14 @@
         <w:keepLines/>
         <w:widowControl w:val="0"/>
         <w:spacing w:line="240" w:lineRule="auto"/>
-      </w:pPr>
-      <w:r>
+        <w:rPr>
+          <w:strike/>
+        </w:rPr>
+      </w:pPr>
+      <w:r>
+        <w:rPr>
+          <w:strike/>
+        </w:rPr>
         <w:t>Add checks that motion commands do not violate stop locations</w:t>
       </w:r>
     </w:p>
@@ -2090,42 +2084,171 @@
         <w:widowControl w:val="0"/>
         <w:spacing w:line="240" w:lineRule="auto"/>
       </w:pPr>
-      <w:r>
-        <w:t>Append data allows all data over multiple script runs to be saved in the first timestamped output file</w:t>
-      </w:r>
-    </w:p>
-    <w:p>
-      <w:pPr>
-        <w:keepNext/>
-        <w:keepLines/>
-        <w:widowControl w:val="0"/>
-        <w:spacing w:line="240" w:lineRule="auto"/>
-      </w:pPr>
-      <w:r>
-        <w:t>Otherwise each script run will produce a new data file</w:t>
-      </w:r>
-    </w:p>
-    <w:p>
-      <w:pPr>
-        <w:keepNext/>
-        <w:keepLines/>
-        <w:widowControl w:val="0"/>
-        <w:spacing w:line="240" w:lineRule="auto"/>
-      </w:pPr>
-      <w:r>
-        <w:t>Continuous mode overrides append data function and forces a new data file each script run</w:t>
-      </w:r>
-    </w:p>
-    <w:p>
-      <w:pPr>
-        <w:keepNext/>
-        <w:keepLines/>
-        <w:widowControl w:val="0"/>
-        <w:spacing w:line="240" w:lineRule="auto"/>
-      </w:pPr>
-      <w:r>
-        <w:t>Continuous mode will run until the switch is turned off, after which the current run will finish</w:t>
-      </w:r>
+    </w:p>
+    <w:p>
+      <w:pPr>
+        <w:keepNext/>
+        <w:keepLines/>
+        <w:widowControl w:val="0"/>
+        <w:spacing w:line="240" w:lineRule="auto"/>
+        <w:rPr>
+          <w:b/>
+          <w:bCs/>
+        </w:rPr>
+      </w:pPr>
+      <w:r>
+        <w:rPr>
+          <w:b/>
+          <w:bCs/>
+        </w:rPr>
+        <w:t>Software Description:</w:t>
+      </w:r>
+    </w:p>
+    <w:p>
+      <w:pPr>
+        <w:keepNext/>
+        <w:keepLines/>
+        <w:widowControl w:val="0"/>
+        <w:spacing w:line="240" w:lineRule="auto"/>
+      </w:pPr>
+      <w:r>
+        <w:t>Continuous mode – override append mode – force new file each run – pass index resets for each file</w:t>
+      </w:r>
+    </w:p>
+    <w:p>
+      <w:pPr>
+        <w:keepNext/>
+        <w:keepLines/>
+        <w:widowControl w:val="0"/>
+        <w:spacing w:line="240" w:lineRule="auto"/>
+      </w:pPr>
+      <w:r>
+        <w:t>Append mode – pass index keeps incrementing and resets at the end of a finite number of script runs</w:t>
+      </w:r>
+    </w:p>
+    <w:p>
+      <w:pPr>
+        <w:keepNext/>
+        <w:keepLines/>
+        <w:widowControl w:val="0"/>
+        <w:spacing w:line="240" w:lineRule="auto"/>
+      </w:pPr>
+    </w:p>
+    <w:p>
+      <w:pPr>
+        <w:keepNext/>
+        <w:keepLines/>
+        <w:widowControl w:val="0"/>
+        <w:spacing w:line="240" w:lineRule="auto"/>
+      </w:pPr>
+      <w:r>
+        <w:t xml:space="preserve">Basin Must be set </w:t>
+      </w:r>
+      <w:r>
+        <w:t>–</w:t>
+      </w:r>
+      <w:r>
+        <w:t xml:space="preserve"> </w:t>
+      </w:r>
+      <w:r>
+        <w:t>sets boolean true</w:t>
+      </w:r>
+    </w:p>
+    <w:p>
+      <w:pPr>
+        <w:keepNext/>
+        <w:keepLines/>
+        <w:widowControl w:val="0"/>
+        <w:spacing w:line="240" w:lineRule="auto"/>
+      </w:pPr>
+      <w:r>
+        <w:t>Boolean must be true to run script</w:t>
+      </w:r>
+    </w:p>
+    <w:p>
+      <w:pPr>
+        <w:keepNext/>
+        <w:keepLines/>
+        <w:widowControl w:val="0"/>
+        <w:spacing w:line="240" w:lineRule="auto"/>
+        <w:rPr>
+          <w:lang w:val="en-US"/>
+        </w:rPr>
+      </w:pPr>
+      <w:r>
+        <w:rPr>
+          <w:lang w:val="en-US"/>
+        </w:rPr>
+        <w:t>Basin sets folder in /data/ fo</w:t>
+      </w:r>
+      <w:r>
+        <w:rPr>
+          <w:lang w:val="en-US"/>
+        </w:rPr>
+        <w:t>r all scripts and data files</w:t>
+      </w:r>
+    </w:p>
+    <w:p>
+      <w:pPr>
+        <w:keepNext/>
+        <w:keepLines/>
+        <w:widowControl w:val="0"/>
+        <w:spacing w:line="240" w:lineRule="auto"/>
+        <w:rPr>
+          <w:lang w:val="en-US"/>
+        </w:rPr>
+      </w:pPr>
+      <w:r>
+        <w:rPr>
+          <w:lang w:val="en-US"/>
+        </w:rPr>
+        <w:t>Optional Boolean to display and record coordinates in basin or absolute values</w:t>
+      </w:r>
+    </w:p>
+    <w:p>
+      <w:pPr>
+        <w:keepNext/>
+        <w:keepLines/>
+        <w:widowControl w:val="0"/>
+        <w:spacing w:line="240" w:lineRule="auto"/>
+        <w:rPr>
+          <w:lang w:val="en-US"/>
+        </w:rPr>
+      </w:pPr>
+      <w:r>
+        <w:rPr>
+          <w:lang w:val="en-US"/>
+        </w:rPr>
+        <w:t>Script is checked for all motion instructions to be inside basin</w:t>
+      </w:r>
+    </w:p>
+    <w:p>
+      <w:pPr>
+        <w:keepNext/>
+        <w:keepLines/>
+        <w:widowControl w:val="0"/>
+        <w:spacing w:line="240" w:lineRule="auto"/>
+        <w:rPr>
+          <w:lang w:val="en-US"/>
+        </w:rPr>
+      </w:pPr>
+      <w:r>
+        <w:rPr>
+          <w:lang w:val="en-US"/>
+        </w:rPr>
+        <w:t>ScriptRead loads basin that was associated with script originally</w:t>
+      </w:r>
+    </w:p>
+    <w:p>
+      <w:pPr>
+        <w:keepNext/>
+        <w:keepLines/>
+        <w:widowControl w:val="0"/>
+        <w:spacing w:line="240" w:lineRule="auto"/>
+        <w:rPr>
+          <w:lang w:val="en-US"/>
+        </w:rPr>
+      </w:pPr>
     </w:p>
     <w:p>
       <w:pPr>

</xml_diff>